<commit_message>
Update Heart Disease Prediction Report
</commit_message>
<xml_diff>
--- a/Heart_Disease_Prediction_Report_GroupW.docx
+++ b/Heart_Disease_Prediction_Report_GroupW.docx
@@ -109,12 +109,6 @@
         <w:gridCol w:w="2000"/>
       </w:tblGrid>
       <w:tr>
-        <w:tblPrEx>
-          <w:tblCellMar>
-            <w:top w:w="0" w:type="dxa"/>
-            <w:bottom w:w="0" w:type="dxa"/>
-          </w:tblCellMar>
-        </w:tblPrEx>
         <w:trPr>
           <w:jc w:val="center"/>
         </w:trPr>
@@ -163,12 +157,6 @@
         </w:tc>
       </w:tr>
       <w:tr>
-        <w:tblPrEx>
-          <w:tblCellMar>
-            <w:top w:w="0" w:type="dxa"/>
-            <w:bottom w:w="0" w:type="dxa"/>
-          </w:tblCellMar>
-        </w:tblPrEx>
         <w:trPr>
           <w:jc w:val="center"/>
         </w:trPr>
@@ -217,12 +205,6 @@
         </w:tc>
       </w:tr>
       <w:tr>
-        <w:tblPrEx>
-          <w:tblCellMar>
-            <w:top w:w="0" w:type="dxa"/>
-            <w:bottom w:w="0" w:type="dxa"/>
-          </w:tblCellMar>
-        </w:tblPrEx>
         <w:trPr>
           <w:jc w:val="center"/>
         </w:trPr>
@@ -271,12 +253,6 @@
         </w:tc>
       </w:tr>
       <w:tr>
-        <w:tblPrEx>
-          <w:tblCellMar>
-            <w:top w:w="0" w:type="dxa"/>
-            <w:bottom w:w="0" w:type="dxa"/>
-          </w:tblCellMar>
-        </w:tblPrEx>
         <w:trPr>
           <w:jc w:val="center"/>
         </w:trPr>
@@ -325,12 +301,6 @@
         </w:tc>
       </w:tr>
       <w:tr>
-        <w:tblPrEx>
-          <w:tblCellMar>
-            <w:top w:w="0" w:type="dxa"/>
-            <w:bottom w:w="0" w:type="dxa"/>
-          </w:tblCellMar>
-        </w:tblPrEx>
         <w:trPr>
           <w:jc w:val="center"/>
         </w:trPr>
@@ -379,12 +349,6 @@
         </w:tc>
       </w:tr>
       <w:tr>
-        <w:tblPrEx>
-          <w:tblCellMar>
-            <w:top w:w="0" w:type="dxa"/>
-            <w:bottom w:w="0" w:type="dxa"/>
-          </w:tblCellMar>
-        </w:tblPrEx>
         <w:trPr>
           <w:jc w:val="center"/>
         </w:trPr>
@@ -467,7 +431,7 @@
       <w:sdtContent>
         <w:p>
           <w:pPr>
-            <w:pStyle w:val="Verzeichnis1"/>
+            <w:pStyle w:val="TOC1"/>
             <w:tabs>
               <w:tab w:val="right" w:leader="dot" w:pos="9350"/>
             </w:tabs>
@@ -537,7 +501,7 @@
         </w:p>
         <w:p>
           <w:pPr>
-            <w:pStyle w:val="Verzeichnis1"/>
+            <w:pStyle w:val="TOC1"/>
             <w:tabs>
               <w:tab w:val="right" w:leader="dot" w:pos="9350"/>
             </w:tabs>
@@ -598,7 +562,7 @@
         </w:p>
         <w:p>
           <w:pPr>
-            <w:pStyle w:val="Verzeichnis2"/>
+            <w:pStyle w:val="TOC2"/>
             <w:tabs>
               <w:tab w:val="right" w:leader="dot" w:pos="9350"/>
             </w:tabs>
@@ -659,7 +623,7 @@
         </w:p>
         <w:p>
           <w:pPr>
-            <w:pStyle w:val="Verzeichnis2"/>
+            <w:pStyle w:val="TOC2"/>
             <w:tabs>
               <w:tab w:val="right" w:leader="dot" w:pos="9350"/>
             </w:tabs>
@@ -720,7 +684,7 @@
         </w:p>
         <w:p>
           <w:pPr>
-            <w:pStyle w:val="Verzeichnis2"/>
+            <w:pStyle w:val="TOC2"/>
             <w:tabs>
               <w:tab w:val="right" w:leader="dot" w:pos="9350"/>
             </w:tabs>
@@ -781,7 +745,7 @@
         </w:p>
         <w:p>
           <w:pPr>
-            <w:pStyle w:val="Verzeichnis1"/>
+            <w:pStyle w:val="TOC1"/>
             <w:tabs>
               <w:tab w:val="right" w:leader="dot" w:pos="9350"/>
             </w:tabs>
@@ -842,7 +806,7 @@
         </w:p>
         <w:p>
           <w:pPr>
-            <w:pStyle w:val="Verzeichnis2"/>
+            <w:pStyle w:val="TOC2"/>
             <w:tabs>
               <w:tab w:val="right" w:leader="dot" w:pos="9350"/>
             </w:tabs>
@@ -903,7 +867,7 @@
         </w:p>
         <w:p>
           <w:pPr>
-            <w:pStyle w:val="Verzeichnis2"/>
+            <w:pStyle w:val="TOC2"/>
             <w:tabs>
               <w:tab w:val="right" w:leader="dot" w:pos="9350"/>
             </w:tabs>
@@ -964,7 +928,7 @@
         </w:p>
         <w:p>
           <w:pPr>
-            <w:pStyle w:val="Verzeichnis2"/>
+            <w:pStyle w:val="TOC2"/>
             <w:tabs>
               <w:tab w:val="right" w:leader="dot" w:pos="9350"/>
             </w:tabs>
@@ -1025,7 +989,7 @@
         </w:p>
         <w:p>
           <w:pPr>
-            <w:pStyle w:val="Verzeichnis2"/>
+            <w:pStyle w:val="TOC2"/>
             <w:tabs>
               <w:tab w:val="right" w:leader="dot" w:pos="9350"/>
             </w:tabs>
@@ -1086,7 +1050,7 @@
         </w:p>
         <w:p>
           <w:pPr>
-            <w:pStyle w:val="Verzeichnis1"/>
+            <w:pStyle w:val="TOC1"/>
             <w:tabs>
               <w:tab w:val="right" w:leader="dot" w:pos="9350"/>
             </w:tabs>
@@ -1147,7 +1111,7 @@
         </w:p>
         <w:p>
           <w:pPr>
-            <w:pStyle w:val="Verzeichnis1"/>
+            <w:pStyle w:val="TOC1"/>
             <w:tabs>
               <w:tab w:val="right" w:leader="dot" w:pos="9350"/>
             </w:tabs>
@@ -1208,7 +1172,7 @@
         </w:p>
         <w:p>
           <w:pPr>
-            <w:pStyle w:val="Verzeichnis2"/>
+            <w:pStyle w:val="TOC2"/>
             <w:tabs>
               <w:tab w:val="right" w:leader="dot" w:pos="9350"/>
             </w:tabs>
@@ -1269,7 +1233,7 @@
         </w:p>
         <w:p>
           <w:pPr>
-            <w:pStyle w:val="Verzeichnis2"/>
+            <w:pStyle w:val="TOC2"/>
             <w:tabs>
               <w:tab w:val="right" w:leader="dot" w:pos="9350"/>
             </w:tabs>
@@ -1330,7 +1294,7 @@
         </w:p>
         <w:p>
           <w:pPr>
-            <w:pStyle w:val="Verzeichnis2"/>
+            <w:pStyle w:val="TOC2"/>
             <w:tabs>
               <w:tab w:val="right" w:leader="dot" w:pos="9350"/>
             </w:tabs>
@@ -1379,7 +1343,7 @@
               <w:rPr>
                 <w:noProof/>
               </w:rPr>
-              <w:t>7</w:t>
+              <w:t>6</w:t>
             </w:r>
             <w:r>
               <w:rPr>
@@ -1391,7 +1355,7 @@
         </w:p>
         <w:p>
           <w:pPr>
-            <w:pStyle w:val="Verzeichnis1"/>
+            <w:pStyle w:val="TOC1"/>
             <w:tabs>
               <w:tab w:val="right" w:leader="dot" w:pos="9350"/>
             </w:tabs>
@@ -1452,7 +1416,7 @@
         </w:p>
         <w:p>
           <w:pPr>
-            <w:pStyle w:val="Verzeichnis1"/>
+            <w:pStyle w:val="TOC1"/>
             <w:tabs>
               <w:tab w:val="right" w:leader="dot" w:pos="9350"/>
             </w:tabs>
@@ -1513,7 +1477,7 @@
         </w:p>
         <w:p>
           <w:pPr>
-            <w:pStyle w:val="Verzeichnis1"/>
+            <w:pStyle w:val="TOC1"/>
             <w:tabs>
               <w:tab w:val="right" w:leader="dot" w:pos="9350"/>
             </w:tabs>
@@ -1591,7 +1555,7 @@
     </w:p>
     <w:p>
       <w:pPr>
-        <w:pStyle w:val="berschrift1"/>
+        <w:pStyle w:val="Heading1"/>
         <w:spacing w:line="360" w:lineRule="auto"/>
         <w:rPr>
           <w:lang w:val="en-US"/>
@@ -1619,35 +1583,7 @@
         <w:rPr>
           <w:lang w:val="en-US"/>
         </w:rPr>
-        <w:t xml:space="preserve">Cardiovascular diseases account for </w:t>
-      </w:r>
-      <w:proofErr w:type="gramStart"/>
-      <w:r>
-        <w:rPr>
-          <w:lang w:val="en-US"/>
-        </w:rPr>
-        <w:t>the majority of</w:t>
-      </w:r>
-      <w:proofErr w:type="gramEnd"/>
-      <w:r>
-        <w:rPr>
-          <w:lang w:val="en-US"/>
-        </w:rPr>
-        <w:t xml:space="preserve"> fatalities globally (World Health Organization [WHO], 2021). In this report, a machine learning-based tool for screening individuals at a higher risk of heart diseases by utilizing normal parameters such as blood pressure, cholesterol levels, results from EKG tests, and results from exercise tests </w:t>
-      </w:r>
-      <w:proofErr w:type="gramStart"/>
-      <w:r>
-        <w:rPr>
-          <w:lang w:val="en-US"/>
-        </w:rPr>
-        <w:t>is</w:t>
-      </w:r>
-      <w:proofErr w:type="gramEnd"/>
-      <w:r>
-        <w:rPr>
-          <w:lang w:val="en-US"/>
-        </w:rPr>
-        <w:t xml:space="preserve"> discussed, which can be used by a regional hospital network for efficient allocation of resources.</w:t>
+        <w:t>Cardiovascular diseases account for the majority of fatalities globally (World Health Organization [WHO], 2021). In this report, a machine learning-based tool for screening individuals at a higher risk of heart diseases by utilizing normal parameters such as blood pressure, cholesterol levels, results from EKG tests, and results from exercise tests is discussed, which can be used by a regional hospital network for efficient allocation of resources.</w:t>
       </w:r>
     </w:p>
     <w:p>
@@ -1664,52 +1600,22 @@
         </w:rPr>
         <w:t xml:space="preserve">Given the clinical context, recall (sensitivity) is the primary evaluation metric. A false negative, predicting absence when a patient </w:t>
       </w:r>
-      <w:proofErr w:type="gramStart"/>
-      <w:r>
-        <w:rPr>
-          <w:lang w:val="en-US"/>
-        </w:rPr>
-        <w:t>actually has</w:t>
-      </w:r>
-      <w:proofErr w:type="gramEnd"/>
-      <w:r>
-        <w:rPr>
-          <w:lang w:val="en-US"/>
-        </w:rPr>
-        <w:t xml:space="preserve"> heart disease, carries far greater cost than a false positive, as missed diagnoses can lead to delayed treatment with potentially fatal consequences. All models are therefore </w:t>
-      </w:r>
-      <w:proofErr w:type="gramStart"/>
-      <w:r>
-        <w:rPr>
-          <w:lang w:val="en-US"/>
-        </w:rPr>
-        <w:t>tuned</w:t>
-      </w:r>
-      <w:proofErr w:type="gramEnd"/>
-      <w:r>
-        <w:rPr>
-          <w:lang w:val="en-US"/>
-        </w:rPr>
-        <w:t xml:space="preserve"> to achieve a minimum 90% recall, with the </w:t>
-      </w:r>
-      <w:proofErr w:type="gramStart"/>
-      <w:r>
-        <w:rPr>
-          <w:lang w:val="en-US"/>
-        </w:rPr>
-        <w:t>F1-score</w:t>
-      </w:r>
-      <w:proofErr w:type="gramEnd"/>
-      <w:r>
-        <w:rPr>
-          <w:lang w:val="en-US"/>
-        </w:rPr>
-        <w:t xml:space="preserve"> as the secondary criterion.</w:t>
-      </w:r>
-    </w:p>
-    <w:p>
-      <w:pPr>
-        <w:pStyle w:val="berschrift1"/>
+      <w:r>
+        <w:rPr>
+          <w:lang w:val="en-US"/>
+        </w:rPr>
+        <w:t>has</w:t>
+      </w:r>
+      <w:r>
+        <w:rPr>
+          <w:lang w:val="en-US"/>
+        </w:rPr>
+        <w:t xml:space="preserve"> heart disease, carries far greater cost than a false positive, as missed diagnoses can lead to delayed treatment with potentially fatal consequences. All models are therefore tuned to achieve a minimum 90% recall, with the F1-score as the secondary criterion.</w:t>
+      </w:r>
+    </w:p>
+    <w:p>
+      <w:pPr>
+        <w:pStyle w:val="Heading1"/>
         <w:spacing w:line="360" w:lineRule="auto"/>
         <w:rPr>
           <w:lang w:val="en-US"/>
@@ -1726,20 +1632,7 @@
     </w:p>
     <w:p>
       <w:pPr>
-        <w:rPr>
-          <w:lang w:val="en-US"/>
-        </w:rPr>
-      </w:pPr>
-      <w:r>
-        <w:rPr>
-          <w:lang w:val="en-US"/>
-        </w:rPr>
-        <w:t>The following subsections describe the dataset, target distribution, and key feature patterns.</w:t>
-      </w:r>
-    </w:p>
-    <w:p>
-      <w:pPr>
-        <w:pStyle w:val="berschrift2"/>
+        <w:pStyle w:val="Heading2"/>
         <w:spacing w:after="120" w:line="360" w:lineRule="auto"/>
         <w:rPr>
           <w:lang w:val="en-US"/>
@@ -1771,7 +1664,7 @@
     </w:p>
     <w:p>
       <w:pPr>
-        <w:pStyle w:val="berschrift2"/>
+        <w:pStyle w:val="Heading2"/>
         <w:spacing w:after="120" w:line="360" w:lineRule="auto"/>
         <w:rPr>
           <w:lang w:val="en-US"/>
@@ -1803,7 +1696,7 @@
     </w:p>
     <w:p>
       <w:pPr>
-        <w:pStyle w:val="berschrift2"/>
+        <w:pStyle w:val="Heading2"/>
         <w:spacing w:after="120" w:line="360" w:lineRule="auto"/>
         <w:rPr>
           <w:lang w:val="en-US"/>
@@ -1830,14 +1723,14 @@
         <w:rPr>
           <w:lang w:val="en-US"/>
         </w:rPr>
-        <w:t xml:space="preserve">Correlation analysis and bivariate exploration identified several strong predictors: thallium stress test results, fluoroscopy vessel count, chest pain type (with asymptomatic pain carrying the </w:t>
+        <w:t xml:space="preserve">Correlation analysis and bivariate exploration identified several strong predictors: thallium stress test results, fluoroscopy vessel count, chest pain type (with asymptomatic pain carrying the highest risk), exercise-induced angina, and ST depression. Maximum heart rate showed a strong </w:t>
       </w:r>
       <w:r>
         <w:rPr>
           <w:lang w:val="en-US"/>
         </w:rPr>
         <w:lastRenderedPageBreak/>
-        <w:t xml:space="preserve">highest risk), exercise-induced angina, and ST depression. Maximum heart rate showed a strong negative correlation with disease presence, consistent with reduced cardiac reserve </w:t>
+        <w:t xml:space="preserve">negative correlation with disease presence, consistent with reduced cardiac reserve </w:t>
       </w:r>
       <w:r>
         <w:rPr>
@@ -1854,7 +1747,7 @@
     </w:p>
     <w:p>
       <w:pPr>
-        <w:pStyle w:val="berschrift1"/>
+        <w:pStyle w:val="Heading1"/>
         <w:spacing w:line="360" w:lineRule="auto"/>
         <w:rPr>
           <w:lang w:val="en-US"/>
@@ -1871,20 +1764,7 @@
     </w:p>
     <w:p>
       <w:pPr>
-        <w:rPr>
-          <w:lang w:val="en-US"/>
-        </w:rPr>
-      </w:pPr>
-      <w:r>
-        <w:rPr>
-          <w:lang w:val="en-US"/>
-        </w:rPr>
-        <w:t>This section covers preprocessing, data splitting, threshold tuning, and model selection.</w:t>
-      </w:r>
-    </w:p>
-    <w:p>
-      <w:pPr>
-        <w:pStyle w:val="berschrift2"/>
+        <w:pStyle w:val="Heading2"/>
         <w:spacing w:after="120" w:line="360" w:lineRule="auto"/>
         <w:rPr>
           <w:lang w:val="en-US"/>
@@ -1916,7 +1796,7 @@
     </w:p>
     <w:p>
       <w:pPr>
-        <w:pStyle w:val="berschrift2"/>
+        <w:pStyle w:val="Heading2"/>
         <w:spacing w:after="120" w:line="360" w:lineRule="auto"/>
         <w:rPr>
           <w:lang w:val="en-US"/>
@@ -1948,7 +1828,7 @@
     </w:p>
     <w:p>
       <w:pPr>
-        <w:pStyle w:val="berschrift2"/>
+        <w:pStyle w:val="Heading2"/>
         <w:spacing w:after="120" w:line="360" w:lineRule="auto"/>
         <w:rPr>
           <w:lang w:val="en-US"/>
@@ -1965,7 +1845,7 @@
     </w:p>
     <w:p>
       <w:pPr>
-        <w:pStyle w:val="berschrift2"/>
+        <w:pStyle w:val="Heading2"/>
         <w:spacing w:after="120" w:line="360" w:lineRule="auto"/>
         <w:rPr>
           <w:b w:val="0"/>
@@ -1991,7 +1871,7 @@
     </w:p>
     <w:p>
       <w:pPr>
-        <w:pStyle w:val="berschrift2"/>
+        <w:pStyle w:val="Heading2"/>
         <w:spacing w:after="120" w:line="360" w:lineRule="auto"/>
         <w:rPr>
           <w:lang w:val="en-US"/>
@@ -2025,14 +1905,14 @@
         <w:rPr>
           <w:lang w:val="en-US"/>
         </w:rPr>
-        <w:t xml:space="preserve">serves as the interpretable baseline (Hosmer et al., 2013). Configured with L2 regularisation (C=1.0), balanced class weights, and standard scaling via a pipeline, it leverages </w:t>
+        <w:t xml:space="preserve">serves as the interpretable baseline (Hosmer et al., 2013). Configured with L2 regularisation (C=1.0), balanced class weights, and standard scaling via a pipeline, it leverages the linear separability observed in several features during the exploratory analysis. Its coefficients </w:t>
       </w:r>
       <w:r>
         <w:rPr>
           <w:lang w:val="en-US"/>
         </w:rPr>
         <w:lastRenderedPageBreak/>
-        <w:t>the linear separability observed in several features during the exploratory analysis. Its coefficients are directly interpretable as log-odds, which is valuable in a clinical setting where transparency in model reasoning supports clinician trust and adoption.</w:t>
+        <w:t>are directly interpretable as log-odds, which is valuable in a clinical setting where transparency in model reasoning supports clinician trust and adoption.</w:t>
       </w:r>
     </w:p>
     <w:p>
@@ -2083,7 +1963,7 @@
     </w:p>
     <w:p>
       <w:pPr>
-        <w:pStyle w:val="berschrift1"/>
+        <w:pStyle w:val="Heading1"/>
         <w:spacing w:line="360" w:lineRule="auto"/>
         <w:rPr>
           <w:lang w:val="en-US"/>
@@ -2140,12 +2020,6 @@
         <w:gridCol w:w="1198"/>
       </w:tblGrid>
       <w:tr>
-        <w:tblPrEx>
-          <w:tblCellMar>
-            <w:top w:w="0" w:type="dxa"/>
-            <w:bottom w:w="0" w:type="dxa"/>
-          </w:tblCellMar>
-        </w:tblPrEx>
         <w:tc>
           <w:tcPr>
             <w:tcW w:w="2200" w:type="dxa"/>
@@ -2344,12 +2218,6 @@
         </w:tc>
       </w:tr>
       <w:tr>
-        <w:tblPrEx>
-          <w:tblCellMar>
-            <w:top w:w="0" w:type="dxa"/>
-            <w:bottom w:w="0" w:type="dxa"/>
-          </w:tblCellMar>
-        </w:tblPrEx>
         <w:tc>
           <w:tcPr>
             <w:tcW w:w="2200" w:type="dxa"/>
@@ -2519,12 +2387,6 @@
         </w:tc>
       </w:tr>
       <w:tr>
-        <w:tblPrEx>
-          <w:tblCellMar>
-            <w:top w:w="0" w:type="dxa"/>
-            <w:bottom w:w="0" w:type="dxa"/>
-          </w:tblCellMar>
-        </w:tblPrEx>
         <w:tc>
           <w:tcPr>
             <w:tcW w:w="2200" w:type="dxa"/>
@@ -2701,12 +2563,6 @@
         </w:tc>
       </w:tr>
       <w:tr>
-        <w:tblPrEx>
-          <w:tblCellMar>
-            <w:top w:w="0" w:type="dxa"/>
-            <w:bottom w:w="0" w:type="dxa"/>
-          </w:tblCellMar>
-        </w:tblPrEx>
         <w:tc>
           <w:tcPr>
             <w:tcW w:w="2200" w:type="dxa"/>
@@ -2936,14 +2792,7 @@
         <w:rPr>
           <w:lang w:val="en-US"/>
         </w:rPr>
-        <w:t xml:space="preserve">The ROC and precision-recall curves further confirmed that HistGradientBoosting consistently dominates across all operating points. The curves remain close together, indicating that all three models offer viable screening performance, but the gradient boosting approach provides </w:t>
-      </w:r>
-      <w:r>
-        <w:rPr>
-          <w:lang w:val="en-US"/>
-        </w:rPr>
-        <w:lastRenderedPageBreak/>
-        <w:t>marginally better discrimination and a more favourable recall-precision trade-off at the chosen operating threshold.</w:t>
+        <w:t>The ROC and precision-recall curves further confirmed that HistGradientBoosting consistently dominates across all operating points. The curves remain close together, indicating that all three models offer viable screening performance, but the gradient boosting approach provides marginally better discrimination and a more favourable recall-precision trade-off at the chosen operating threshold.</w:t>
       </w:r>
     </w:p>
     <w:p>
@@ -2958,12 +2807,13 @@
         <w:rPr>
           <w:lang w:val="en-US"/>
         </w:rPr>
+        <w:lastRenderedPageBreak/>
         <w:t>Random Forest feature importance analysis revealed that the thallium stress test, number of fluoroscopy-coloured vessels, chest pain type, and ST depression were the most influential predictors. These findings align with established cardiology knowledge and the patterns observed during the exploratory analysis, providing clinical face validity for the model outputs.</w:t>
       </w:r>
     </w:p>
     <w:p>
       <w:pPr>
-        <w:pStyle w:val="berschrift1"/>
+        <w:pStyle w:val="Heading1"/>
         <w:spacing w:line="360" w:lineRule="auto"/>
         <w:rPr>
           <w:lang w:val="en-US"/>
@@ -2980,21 +2830,7 @@
     </w:p>
     <w:p>
       <w:pPr>
-        <w:spacing w:line="360" w:lineRule="auto"/>
-        <w:rPr>
-          <w:lang w:val="en-US"/>
-        </w:rPr>
-      </w:pPr>
-      <w:r>
-        <w:rPr>
-          <w:lang w:val="en-US"/>
-        </w:rPr>
-        <w:t>This section translates the model results into deployment guidance and actionable recommendations.</w:t>
-      </w:r>
-    </w:p>
-    <w:p>
-      <w:pPr>
-        <w:pStyle w:val="berschrift2"/>
+        <w:pStyle w:val="Heading2"/>
         <w:spacing w:after="120" w:line="360" w:lineRule="auto"/>
         <w:rPr>
           <w:lang w:val="en-US"/>
@@ -3041,7 +2877,7 @@
     </w:p>
     <w:p>
       <w:pPr>
-        <w:pStyle w:val="berschrift2"/>
+        <w:pStyle w:val="Heading2"/>
         <w:spacing w:after="120" w:line="360" w:lineRule="auto"/>
         <w:rPr>
           <w:lang w:val="en-US"/>
@@ -3070,51 +2906,40 @@
         </w:rPr>
         <w:t xml:space="preserve">Under the chosen operating </w:t>
       </w:r>
-      <w:proofErr w:type="spellStart"/>
-      <w:r>
-        <w:rPr>
-          <w:lang w:val="en-US"/>
-        </w:rPr>
-        <w:t>treshold</w:t>
-      </w:r>
-      <w:proofErr w:type="spellEnd"/>
+      <w:r>
+        <w:rPr>
+          <w:lang w:val="en-US"/>
+        </w:rPr>
+        <w:t>threshold</w:t>
+      </w:r>
       <w:r>
         <w:rPr>
           <w:lang w:val="en-US"/>
         </w:rPr>
         <w:t xml:space="preserve">, the model has a recall of approximately 90% for actual heart disease cases and a precision of approximately 85%. In other words, for every 100 patients identified as high-risk, approximately 85 will </w:t>
       </w:r>
-      <w:proofErr w:type="gramStart"/>
-      <w:r>
-        <w:rPr>
-          <w:lang w:val="en-US"/>
-        </w:rPr>
-        <w:t>actually suffer</w:t>
-      </w:r>
-      <w:proofErr w:type="gramEnd"/>
-      <w:r>
-        <w:rPr>
-          <w:lang w:val="en-US"/>
-        </w:rPr>
-        <w:t xml:space="preserve"> from heart disease. The remaining 15 will incur an unnecessary referral to a specialist, a process that is far less costly than the consequences of a false negative. The hospital can look forward to the reduction of the specialist referral queue as the screening tool eliminates a significant percentage of low-risk patients at the digital intake stage.</w:t>
-      </w:r>
-    </w:p>
-    <w:p>
-      <w:pPr>
-        <w:rPr>
-          <w:lang w:val="en-US"/>
-        </w:rPr>
-      </w:pPr>
-      <w:r>
-        <w:rPr>
-          <w:lang w:val="en-US"/>
-        </w:rPr>
-        <w:br w:type="page"/>
-      </w:r>
-    </w:p>
-    <w:p>
-      <w:pPr>
-        <w:pStyle w:val="berschrift2"/>
+      <w:r>
+        <w:rPr>
+          <w:lang w:val="en-US"/>
+        </w:rPr>
+        <w:t>suffer</w:t>
+      </w:r>
+      <w:r>
+        <w:rPr>
+          <w:lang w:val="en-US"/>
+        </w:rPr>
+        <w:t xml:space="preserve"> from heart disease. The remaining 15 will incur an unnecessary referral to a specialist, a process that is far less costly than the consequences of a false negative. The hospital can look forward to the reduction of the specialist referral queue as the screening tool eliminates a significant percentage of low-risk patients at the digital intake stage</w:t>
+      </w:r>
+      <w:r>
+        <w:rPr>
+          <w:lang w:val="en-US"/>
+        </w:rPr>
+        <w:t>.</w:t>
+      </w:r>
+    </w:p>
+    <w:p>
+      <w:pPr>
+        <w:pStyle w:val="Heading2"/>
         <w:spacing w:after="120" w:line="360" w:lineRule="auto"/>
         <w:rPr>
           <w:lang w:val="en-US"/>
@@ -3125,7 +2950,6 @@
         <w:rPr>
           <w:lang w:val="en-US"/>
         </w:rPr>
-        <w:lastRenderedPageBreak/>
         <w:t>5.3 Actionable Recommendations</w:t>
       </w:r>
       <w:bookmarkEnd w:id="14"/>
@@ -3142,12 +2966,19 @@
         <w:rPr>
           <w:lang w:val="en-US"/>
         </w:rPr>
-        <w:t>First, the hospital should integrate the model into the patient intake workflow as a digital pre-screening step, feeding routine metrics directly into the model to generate a risk score before specialist consultation. Second, given the importance of thallium stress test and fluoroscopy results as top predictors, these tests should be routinely conducted and accurately recorded. Third, the decision threshold should be reviewed periodically based on capacity constraints — during high demand, it can be lowered to cast a wider net. Fourth, the model should be retrained quarterly as new labelled data becomes available. Finally, a clinical validation study comparing model-assisted screening against the current standard of care would provide the evidence base for broader institutional adoption.</w:t>
-      </w:r>
-    </w:p>
-    <w:p>
-      <w:pPr>
-        <w:pStyle w:val="berschrift1"/>
+        <w:t xml:space="preserve">First, the hospital should integrate the model into the patient intake workflow as a digital pre-screening step, feeding routine metrics directly into the model to generate a risk score before specialist consultation. Second, given the importance of thallium stress test and fluoroscopy results as top predictors, these tests should be routinely conducted and accurately recorded. Third, the decision threshold should be reviewed periodically based on capacity constraints — </w:t>
+      </w:r>
+      <w:r>
+        <w:rPr>
+          <w:lang w:val="en-US"/>
+        </w:rPr>
+        <w:lastRenderedPageBreak/>
+        <w:t>during high demand, it can be lowered to cast a wider net. Fourth, the model should be retrained quarterly as new labelled data becomes available. Finally, a clinical validation study comparing model-assisted screening against the current standard of care would provide the evidence base for broader institutional adoption.</w:t>
+      </w:r>
+    </w:p>
+    <w:p>
+      <w:pPr>
+        <w:pStyle w:val="Heading1"/>
         <w:spacing w:line="360" w:lineRule="auto"/>
         <w:rPr>
           <w:lang w:val="en-US"/>
@@ -3174,82 +3005,38 @@
         <w:rPr>
           <w:lang w:val="en-US"/>
         </w:rPr>
-        <w:t xml:space="preserve">Some limitations must be noted: while this </w:t>
-      </w:r>
-      <w:proofErr w:type="gramStart"/>
-      <w:r>
-        <w:rPr>
-          <w:lang w:val="en-US"/>
-        </w:rPr>
-        <w:t>dataset</w:t>
-      </w:r>
-      <w:proofErr w:type="gramEnd"/>
-      <w:r>
-        <w:rPr>
-          <w:lang w:val="en-US"/>
-        </w:rPr>
-        <w:t xml:space="preserve"> is based on a certain patient population, </w:t>
-      </w:r>
-      <w:proofErr w:type="gramStart"/>
-      <w:r>
-        <w:rPr>
-          <w:lang w:val="en-US"/>
-        </w:rPr>
-        <w:t>results on</w:t>
-      </w:r>
-      <w:proofErr w:type="gramEnd"/>
-      <w:r>
-        <w:rPr>
-          <w:lang w:val="en-US"/>
-        </w:rPr>
-        <w:t xml:space="preserve"> demographically different populations have yet to be validated. No hyperparameter tuning was performed (e.g., via a grid search or Bayesian </w:t>
+        <w:t xml:space="preserve">Some limitations must be noted: while this dataset is based on a certain patient population, results on demographically different populations have yet to be validated. No hyperparameter tuning was performed (e.g., via a grid search or Bayesian </w:t>
+      </w:r>
+      <w:r>
+        <w:rPr>
+          <w:lang w:val="en-US"/>
+        </w:rPr>
+        <w:t>optimization</w:t>
+      </w:r>
+      <w:r>
+        <w:rPr>
+          <w:lang w:val="en-US"/>
+        </w:rPr>
+        <w:t xml:space="preserve">). The hyperparameters used were reasonable defaults and domain knowledge. No exploration of engineered features such as interaction terms was performed, which can often be beneficial for a linear model. Interpretability for </w:t>
       </w:r>
       <w:proofErr w:type="spellStart"/>
       <w:r>
         <w:rPr>
           <w:lang w:val="en-US"/>
         </w:rPr>
-        <w:t>optimisation</w:t>
+        <w:t>HistGradientBoosting</w:t>
       </w:r>
       <w:proofErr w:type="spellEnd"/>
       <w:r>
         <w:rPr>
           <w:lang w:val="en-US"/>
         </w:rPr>
-        <w:t xml:space="preserve">). The hyperparameters used were reasonable defaults and domain knowledge. No exploration of engineered features such as interaction terms was performed, which can often be beneficial for a linear model. Interpretability for </w:t>
-      </w:r>
-      <w:proofErr w:type="spellStart"/>
-      <w:r>
-        <w:rPr>
-          <w:lang w:val="en-US"/>
-        </w:rPr>
-        <w:t>HistGradientBoosting</w:t>
-      </w:r>
-      <w:proofErr w:type="spellEnd"/>
-      <w:r>
-        <w:rPr>
-          <w:lang w:val="en-US"/>
-        </w:rPr>
-        <w:t xml:space="preserve"> is poor by default; in the future, SHAP values or partial dependence plots can be used for patient-level interpretability. Validation on a different </w:t>
-      </w:r>
-      <w:proofErr w:type="gramStart"/>
-      <w:r>
-        <w:rPr>
-          <w:lang w:val="en-US"/>
-        </w:rPr>
-        <w:t>hospital’s</w:t>
-      </w:r>
-      <w:proofErr w:type="gramEnd"/>
-      <w:r>
-        <w:rPr>
-          <w:lang w:val="en-US"/>
-        </w:rPr>
-        <w:t xml:space="preserve"> dataset would be beneficial for a production deployment scenario.</w:t>
-      </w:r>
-    </w:p>
-    <w:p>
-      <w:pPr>
-        <w:pStyle w:val="berschrift1"/>
+        <w:t xml:space="preserve"> is poor by default; in the future, SHAP values or partial dependence plots can be used for patient-level interpretability. Validation on a different hospital’s dataset would be beneficial for a production deployment scenario.</w:t>
+      </w:r>
+    </w:p>
+    <w:p>
+      <w:pPr>
+        <w:pStyle w:val="Heading1"/>
         <w:spacing w:line="360" w:lineRule="auto"/>
         <w:rPr>
           <w:lang w:val="en-US"/>
@@ -3305,6 +3092,69 @@
           <w:lang w:val="en-US"/>
         </w:rPr>
         <w:t xml:space="preserve"> having the best performance of all models, as indicated by its 0.956 ROC AUC score and 0.878 F1 score. The results showed that thallium stress test, fluoroscopy vessel count, type of chest pain, and depression of ST were the most important features, which are all supported by current cardiology practices. The suggested plan allows the hospital to automate the process of screening, utilizing the top-performing gradient boosting model, while at the same time utilizing the logistic model to better understand the process, thus helping the hospital improve patient health outcomes through early detection of heart disease.</w:t>
+      </w:r>
+    </w:p>
+    <w:p>
+      <w:pPr>
+        <w:spacing w:after="120" w:line="360" w:lineRule="auto"/>
+        <w:jc w:val="both"/>
+        <w:rPr>
+          <w:lang w:val="en-US"/>
+        </w:rPr>
+      </w:pPr>
+    </w:p>
+    <w:p>
+      <w:pPr>
+        <w:spacing w:after="120" w:line="360" w:lineRule="auto"/>
+        <w:jc w:val="both"/>
+        <w:rPr>
+          <w:rFonts w:asciiTheme="minorBidi" w:hAnsiTheme="minorBidi" w:cstheme="minorBidi"/>
+          <w:lang w:val="en-US"/>
+        </w:rPr>
+      </w:pPr>
+      <w:r>
+        <w:rPr>
+          <w:b/>
+          <w:bCs/>
+          <w:lang w:val="en-US"/>
+        </w:rPr>
+        <w:t>NOTE:</w:t>
+      </w:r>
+      <w:r>
+        <w:rPr>
+          <w:lang w:val="en-US"/>
+        </w:rPr>
+        <w:t xml:space="preserve"> </w:t>
+      </w:r>
+      <w:r>
+        <w:rPr>
+          <w:rFonts w:asciiTheme="minorBidi" w:hAnsiTheme="minorBidi" w:cstheme="minorBidi"/>
+          <w:i/>
+          <w:iCs/>
+        </w:rPr>
+        <w:t xml:space="preserve">Additional figures (EDA plots, ROC and precision–recall curves, confusion </w:t>
+      </w:r>
+      <w:r>
+        <w:rPr>
+          <w:rFonts w:asciiTheme="minorBidi" w:hAnsiTheme="minorBidi" w:cstheme="minorBidi"/>
+          <w:i/>
+          <w:iCs/>
+        </w:rPr>
+        <w:t>Matrices</w:t>
+      </w:r>
+      <w:r>
+        <w:rPr>
+          <w:rFonts w:asciiTheme="minorBidi" w:hAnsiTheme="minorBidi" w:cstheme="minorBidi"/>
+          <w:i/>
+          <w:iCs/>
+        </w:rPr>
+        <w:t>, and feature importance charts) are available in the accompanying Jupyter notebook</w:t>
+      </w:r>
+      <w:r>
+        <w:rPr>
+          <w:rFonts w:asciiTheme="minorBidi" w:hAnsiTheme="minorBidi" w:cstheme="minorBidi"/>
+        </w:rPr>
+        <w:t>.</w:t>
       </w:r>
     </w:p>
     <w:p>
@@ -3321,10 +3171,16 @@
           <w:docGrid w:linePitch="360"/>
         </w:sectPr>
       </w:pPr>
-    </w:p>
-    <w:p>
-      <w:pPr>
-        <w:pStyle w:val="berschrift1"/>
+      <w:r>
+        <w:rPr>
+          <w:lang w:val="en-US"/>
+        </w:rPr>
+        <w:br/>
+      </w:r>
+    </w:p>
+    <w:p>
+      <w:pPr>
+        <w:pStyle w:val="Heading1"/>
         <w:spacing w:line="360" w:lineRule="auto"/>
         <w:rPr>
           <w:lang w:val="en-US"/>
@@ -4348,11 +4204,11 @@
     <w:lsdException w:name="Unresolved Mention" w:semiHidden="1" w:unhideWhenUsed="1"/>
     <w:lsdException w:name="Smart Link" w:semiHidden="1" w:unhideWhenUsed="1"/>
   </w:latentStyles>
-  <w:style w:type="paragraph" w:default="1" w:styleId="Standard">
+  <w:style w:type="paragraph" w:default="1" w:styleId="Normal">
     <w:name w:val="Normal"/>
     <w:qFormat/>
   </w:style>
-  <w:style w:type="paragraph" w:styleId="berschrift1">
+  <w:style w:type="paragraph" w:styleId="Heading1">
     <w:name w:val="heading 1"/>
     <w:uiPriority w:val="9"/>
     <w:qFormat/>
@@ -4368,7 +4224,7 @@
       <w:szCs w:val="28"/>
     </w:rPr>
   </w:style>
-  <w:style w:type="paragraph" w:styleId="berschrift2">
+  <w:style w:type="paragraph" w:styleId="Heading2">
     <w:name w:val="heading 2"/>
     <w:uiPriority w:val="9"/>
     <w:unhideWhenUsed/>
@@ -4385,7 +4241,7 @@
       <w:szCs w:val="24"/>
     </w:rPr>
   </w:style>
-  <w:style w:type="paragraph" w:styleId="berschrift3">
+  <w:style w:type="paragraph" w:styleId="Heading3">
     <w:name w:val="heading 3"/>
     <w:uiPriority w:val="9"/>
     <w:semiHidden/>
@@ -4400,7 +4256,7 @@
       <w:bCs/>
     </w:rPr>
   </w:style>
-  <w:style w:type="paragraph" w:styleId="berschrift4">
+  <w:style w:type="paragraph" w:styleId="Heading4">
     <w:name w:val="heading 4"/>
     <w:uiPriority w:val="9"/>
     <w:semiHidden/>
@@ -4415,7 +4271,7 @@
       <w:color w:val="2E74B5"/>
     </w:rPr>
   </w:style>
-  <w:style w:type="paragraph" w:styleId="berschrift5">
+  <w:style w:type="paragraph" w:styleId="Heading5">
     <w:name w:val="heading 5"/>
     <w:uiPriority w:val="9"/>
     <w:semiHidden/>
@@ -4428,7 +4284,7 @@
       <w:color w:val="2E74B5"/>
     </w:rPr>
   </w:style>
-  <w:style w:type="paragraph" w:styleId="berschrift6">
+  <w:style w:type="paragraph" w:styleId="Heading6">
     <w:name w:val="heading 6"/>
     <w:uiPriority w:val="9"/>
     <w:semiHidden/>
@@ -4441,12 +4297,13 @@
       <w:color w:val="1F4D78"/>
     </w:rPr>
   </w:style>
-  <w:style w:type="character" w:default="1" w:styleId="Absatz-Standardschriftart">
+  <w:style w:type="character" w:default="1" w:styleId="DefaultParagraphFont">
     <w:name w:val="Default Paragraph Font"/>
     <w:uiPriority w:val="1"/>
+    <w:semiHidden/>
     <w:unhideWhenUsed/>
   </w:style>
-  <w:style w:type="table" w:default="1" w:styleId="NormaleTabelle">
+  <w:style w:type="table" w:default="1" w:styleId="TableNormal">
     <w:name w:val="Normal Table"/>
     <w:uiPriority w:val="99"/>
     <w:semiHidden/>
@@ -4461,13 +4318,13 @@
       </w:tblCellMar>
     </w:tblPr>
   </w:style>
-  <w:style w:type="numbering" w:default="1" w:styleId="KeineListe">
+  <w:style w:type="numbering" w:default="1" w:styleId="NoList">
     <w:name w:val="No List"/>
     <w:uiPriority w:val="99"/>
     <w:semiHidden/>
     <w:unhideWhenUsed/>
   </w:style>
-  <w:style w:type="paragraph" w:styleId="Titel">
+  <w:style w:type="paragraph" w:styleId="Title">
     <w:name w:val="Title"/>
     <w:uiPriority w:val="10"/>
     <w:qFormat/>
@@ -4484,7 +4341,7 @@
       <w:bCs/>
     </w:rPr>
   </w:style>
-  <w:style w:type="paragraph" w:styleId="Listenabsatz">
+  <w:style w:type="paragraph" w:styleId="ListParagraph">
     <w:name w:val="List Paragraph"/>
     <w:qFormat/>
   </w:style>
@@ -4497,7 +4354,7 @@
       <w:u w:val="single"/>
     </w:rPr>
   </w:style>
-  <w:style w:type="character" w:styleId="Funotenzeichen">
+  <w:style w:type="character" w:styleId="FootnoteReference">
     <w:name w:val="footnote reference"/>
     <w:uiPriority w:val="99"/>
     <w:semiHidden/>
@@ -4506,9 +4363,9 @@
       <w:vertAlign w:val="superscript"/>
     </w:rPr>
   </w:style>
-  <w:style w:type="paragraph" w:styleId="Funotentext">
+  <w:style w:type="paragraph" w:styleId="FootnoteText">
     <w:name w:val="footnote text"/>
-    <w:link w:val="FunotentextZchn"/>
+    <w:link w:val="FootnoteTextChar"/>
     <w:uiPriority w:val="99"/>
     <w:semiHidden/>
     <w:unhideWhenUsed/>
@@ -4517,9 +4374,9 @@
       <w:szCs w:val="20"/>
     </w:rPr>
   </w:style>
-  <w:style w:type="character" w:customStyle="1" w:styleId="FunotentextZchn">
-    <w:name w:val="Fußnotentext Zchn"/>
-    <w:link w:val="Funotentext"/>
+  <w:style w:type="character" w:customStyle="1" w:styleId="FootnoteTextChar">
+    <w:name w:val="Footnote Text Char"/>
+    <w:link w:val="FootnoteText"/>
     <w:uiPriority w:val="99"/>
     <w:semiHidden/>
     <w:unhideWhenUsed/>
@@ -4528,10 +4385,10 @@
       <w:szCs w:val="20"/>
     </w:rPr>
   </w:style>
-  <w:style w:type="paragraph" w:styleId="Verzeichnis1">
+  <w:style w:type="paragraph" w:styleId="TOC1">
     <w:name w:val="toc 1"/>
-    <w:basedOn w:val="Standard"/>
-    <w:next w:val="Standard"/>
+    <w:basedOn w:val="Normal"/>
+    <w:next w:val="Normal"/>
     <w:autoRedefine/>
     <w:uiPriority w:val="39"/>
     <w:unhideWhenUsed/>
@@ -4540,10 +4397,10 @@
       <w:spacing w:after="100"/>
     </w:pPr>
   </w:style>
-  <w:style w:type="paragraph" w:styleId="Verzeichnis2">
+  <w:style w:type="paragraph" w:styleId="TOC2">
     <w:name w:val="toc 2"/>
-    <w:basedOn w:val="Standard"/>
-    <w:next w:val="Standard"/>
+    <w:basedOn w:val="Normal"/>
+    <w:next w:val="Normal"/>
     <w:autoRedefine/>
     <w:uiPriority w:val="39"/>
     <w:unhideWhenUsed/>

</xml_diff>